<commit_message>
Add handoff v14 for UAT preparation; update SPMP
Co-Authored-By: Claude Opus 5.5 <noreply@anthropic.com>
</commit_message>
<xml_diff>
--- a/01-Project Management/01 - EduCheck_SPMP_v1.0_1.docx
+++ b/01-Project Management/01 - EduCheck_SPMP_v1.0_1.docx
@@ -19,6 +19,25 @@
         <w:t>EduCheck</w:t>
       </w:r>
       <w:proofErr w:type="spellEnd"/>
+    </w:p>
+    <w:p>
+      <w:pPr>
+        <w:spacing w:after="400"/>
+        <w:jc w:val="center"/>
+        <w:rPr>
+          <w:color w:val="444444"/>
+          <w:sz w:val="32"/>
+          <w:szCs w:val="32"/>
+        </w:rPr>
+      </w:pPr>
+      <w:r>
+        <w:rPr>
+          <w:color w:val="444444"/>
+          <w:sz w:val="32"/>
+          <w:szCs w:val="32"/>
+        </w:rPr>
+        <w:t>A Rule-Based Web and Mobile System for Academic Record Consolidation, Validation, and Submission in Government Elementary Schools</w:t>
+      </w:r>
     </w:p>
     <w:p>
       <w:pPr>
@@ -3551,6 +3570,7 @@
         <w:spacing w:after="80"/>
       </w:pPr>
       <w:r>
+        <w:lastRenderedPageBreak/>
         <w:t>On the mobile app, the last-synced submission statuses and notifications stay viewable without a connection and refresh once access is restored (M-10). Uploading or reviewing records offline on the web is out of scope.</w:t>
       </w:r>
     </w:p>
@@ -3559,7 +3579,6 @@
         <w:pStyle w:val="Heading3"/>
       </w:pPr>
       <w:r>
-        <w:lastRenderedPageBreak/>
         <w:t>9. Subject-Based Role Access Control (RBAC)</w:t>
       </w:r>
     </w:p>
@@ -3898,6 +3917,7 @@
         <w:spacing w:after="40"/>
       </w:pPr>
       <w:r>
+        <w:lastRenderedPageBreak/>
         <w:t>Subject Teacher (departmentalized section) or Class Adviser (self-contained section)</w:t>
       </w:r>
     </w:p>
@@ -3940,7 +3960,6 @@
         <w:spacing w:after="40"/>
       </w:pPr>
       <w:r>
-        <w:lastRenderedPageBreak/>
         <w:t>Upload Excel File (assigned subject and section only)</w:t>
       </w:r>
     </w:p>
@@ -4644,6 +4663,7 @@
                 <w:sz w:val="20"/>
                 <w:szCs w:val="20"/>
               </w:rPr>
+              <w:lastRenderedPageBreak/>
               <w:t>Notifications</w:t>
             </w:r>
           </w:p>
@@ -4828,7 +4848,6 @@
                 <w:sz w:val="20"/>
                 <w:szCs w:val="20"/>
               </w:rPr>
-              <w:lastRenderedPageBreak/>
               <w:t>Role</w:t>
             </w:r>
           </w:p>
@@ -5387,6 +5406,7 @@
           <w:b/>
           <w:bCs/>
         </w:rPr>
+        <w:lastRenderedPageBreak/>
         <w:t>Excluded:</w:t>
       </w:r>
     </w:p>
@@ -5525,7 +5545,6 @@
                 <w:sz w:val="20"/>
                 <w:szCs w:val="20"/>
               </w:rPr>
-              <w:lastRenderedPageBreak/>
               <w:t>Layer</w:t>
             </w:r>
           </w:p>
@@ -6141,6 +6160,7 @@
                 <w:sz w:val="20"/>
                 <w:szCs w:val="20"/>
               </w:rPr>
+              <w:lastRenderedPageBreak/>
               <w:t>Class Adviser</w:t>
             </w:r>
           </w:p>
@@ -6324,7 +6344,6 @@
                 <w:sz w:val="20"/>
                 <w:szCs w:val="20"/>
               </w:rPr>
-              <w:lastRenderedPageBreak/>
               <w:t>#</w:t>
             </w:r>
           </w:p>
@@ -7470,6 +7489,7 @@
         <w:spacing w:after="160" w:line="276" w:lineRule="auto"/>
       </w:pPr>
       <w:r>
+        <w:lastRenderedPageBreak/>
         <w:t>To keep the supplementary-tool positioning consistent with the manuscript and realistic for the project timeline, the following stay web-only:</w:t>
       </w:r>
     </w:p>
@@ -7766,7 +7786,6 @@
                 <w:sz w:val="20"/>
                 <w:szCs w:val="20"/>
               </w:rPr>
-              <w:lastRenderedPageBreak/>
               <w:t xml:space="preserve">Aira Jeanelle </w:t>
             </w:r>
             <w:proofErr w:type="spellStart"/>
@@ -8420,6 +8439,7 @@
       </w:pPr>
       <w:bookmarkStart w:id="22" w:name="_Toc239847198"/>
       <w:r>
+        <w:lastRenderedPageBreak/>
         <w:t>8.1 Product Roadmap</w:t>
       </w:r>
       <w:bookmarkEnd w:id="22"/>
@@ -9117,7 +9137,6 @@
                 <w:sz w:val="20"/>
                 <w:szCs w:val="20"/>
               </w:rPr>
-              <w:lastRenderedPageBreak/>
               <w:t>Sprint 9</w:t>
             </w:r>
           </w:p>
@@ -9772,6 +9791,7 @@
         <w:spacing w:after="80"/>
       </w:pPr>
       <w:r>
+        <w:lastRenderedPageBreak/>
         <w:t>Drag-and-drop Excel upload per subject and section</w:t>
       </w:r>
     </w:p>
@@ -9900,7 +9920,6 @@
         <w:spacing w:after="80"/>
       </w:pPr>
       <w:r>
-        <w:lastRenderedPageBreak/>
         <w:t xml:space="preserve">Automatic generation from a </w:t>
       </w:r>
       <w:proofErr w:type="gramStart"/>
@@ -10384,6 +10403,7 @@
                 <w:sz w:val="20"/>
                 <w:szCs w:val="20"/>
               </w:rPr>
+              <w:lastRenderedPageBreak/>
               <w:t>US-002</w:t>
             </w:r>
           </w:p>
@@ -10959,7 +10979,6 @@
                 <w:sz w:val="20"/>
                 <w:szCs w:val="20"/>
               </w:rPr>
-              <w:lastRenderedPageBreak/>
               <w:t>US-007</w:t>
             </w:r>
           </w:p>
@@ -11593,7 +11612,7 @@
                 <w:sz w:val="20"/>
                 <w:szCs w:val="20"/>
               </w:rPr>
-              <w:t xml:space="preserve">As a Class Adviser, I want a performance dashboard and intervention flag list for my own section so that I can spot learners who need help early.</w:t>
+              <w:t>As a Class Adviser, I want a performance dashboard and intervention flag list for my own section so that I can spot learners who need help early.</w:t>
             </w:r>
           </w:p>
         </w:tc>
@@ -11686,6 +11705,7 @@
                 <w:sz w:val="20"/>
                 <w:szCs w:val="20"/>
               </w:rPr>
+              <w:lastRenderedPageBreak/>
               <w:t>US-013</w:t>
             </w:r>
           </w:p>
@@ -11708,7 +11728,7 @@
                 <w:sz w:val="20"/>
                 <w:szCs w:val="20"/>
               </w:rPr>
-              <w:t xml:space="preserve">As a Class Adviser, I want to search the repository for learners in my own section by LRN, name, grade level or school year so that I can open their records quickly.</w:t>
+              <w:t>As a Class Adviser, I want to search the repository for learners in my own section by LRN, name, grade level or school year so that I can open their records quickly.</w:t>
             </w:r>
           </w:p>
         </w:tc>
@@ -11823,7 +11843,7 @@
                 <w:sz w:val="20"/>
                 <w:szCs w:val="20"/>
               </w:rPr>
-              <w:t xml:space="preserve">As a Class Adviser or School Administrator, I want to enter a learner's grades from school years before EduCheck on their permanent record so that the SF10 covers every grade level.</w:t>
+              <w:t>As a Class Adviser or School Administrator, I want to enter a learner's grades from school years before EduCheck on their permanent record so that the SF10 covers every grade level.</w:t>
             </w:r>
           </w:p>
         </w:tc>
@@ -12100,7 +12120,6 @@
         <w:spacing w:after="160" w:line="276" w:lineRule="auto"/>
       </w:pPr>
       <w:r>
-        <w:lastRenderedPageBreak/>
         <w:t>A user story is considered ready when:</w:t>
       </w:r>
     </w:p>
@@ -12192,6 +12211,7 @@
         <w:spacing w:after="160" w:line="276" w:lineRule="auto"/>
       </w:pPr>
       <w:r>
+        <w:lastRenderedPageBreak/>
         <w:t>A feature is considered complete when:</w:t>
       </w:r>
     </w:p>
@@ -12493,7 +12513,6 @@
         <w:spacing w:after="80"/>
       </w:pPr>
       <w:r>
-        <w:lastRenderedPageBreak/>
         <w:t>Unit Testing</w:t>
       </w:r>
     </w:p>
@@ -12608,6 +12627,7 @@
                 <w:sz w:val="20"/>
                 <w:szCs w:val="20"/>
               </w:rPr>
+              <w:lastRenderedPageBreak/>
               <w:t>Risk</w:t>
             </w:r>
           </w:p>
@@ -12869,7 +12889,7 @@
                 <w:sz w:val="20"/>
                 <w:szCs w:val="20"/>
               </w:rPr>
-              <w:t xml:space="preserve">Offline status caching on mobile (M-10), refreshed when connectivity returns.</w:t>
+              <w:t xml:space="preserve">Offline status </w:t>
             </w:r>
             <w:proofErr w:type="gramStart"/>
             <w:r>
@@ -12878,7 +12898,7 @@
                 <w:sz w:val="20"/>
                 <w:szCs w:val="20"/>
               </w:rPr>
-              <w:t/>
+              <w:t>caching</w:t>
             </w:r>
             <w:proofErr w:type="gramEnd"/>
             <w:r>
@@ -12887,7 +12907,7 @@
                 <w:sz w:val="20"/>
                 <w:szCs w:val="20"/>
               </w:rPr>
-              <w:t xml:space="preserve"/>
+              <w:t xml:space="preserve"> on mobile (M-10), refreshed when connectivity returns.</w:t>
             </w:r>
           </w:p>
         </w:tc>
@@ -14133,7 +14153,6 @@
   <w:style w:type="character" w:default="1" w:styleId="DefaultParagraphFont">
     <w:name w:val="Default Paragraph Font"/>
     <w:uiPriority w:val="1"/>
-    <w:semiHidden/>
     <w:unhideWhenUsed/>
   </w:style>
   <w:style w:type="table" w:default="1" w:styleId="TableNormal">

</xml_diff>

<commit_message>
Update docs for the Accounts page and Principal account approval
- SPMP: add US-015 (Principal approval and account setup), update US-008,
  roles, modules, EPIC-01 and a risk for unsent account emails.
- Known Limitations: L-02/L-05 point to Accounts; new L-06 (account
  emails need internet) and D-10 (approval flow); D-03 updated; note
  that restoring a pre-2026-10-17 backup needs migrations 010 and 011.
- UAT workbook: TC-012 to TC-016 and TC-044 rewritten, new TC-072 to
  TC-076, Summary rows renamed to Accounts / Account Approvals.
- UAT Day Kit: approval steps in the Admin and Principal run sheets and
  re-applying migrations after a restore.
- Heuristic form: task 8 (account approval) and the mobile Server address.
- Migrations README: 010 and 011 are applied.

Co-Authored-By: Claude Opus 5.5 <noreply@anthropic.com>
</commit_message>
<xml_diff>
--- a/01-Project Management/01 - EduCheck_SPMP_v1.0_1.docx
+++ b/01-Project Management/01 - EduCheck_SPMP_v1.0_1.docx
@@ -7,7 +7,6 @@
         <w:spacing w:before="2200" w:after="100"/>
         <w:jc w:val="center"/>
       </w:pPr>
-      <w:proofErr w:type="spellStart"/>
       <w:r>
         <w:rPr>
           <w:b/>
@@ -18,7 +17,6 @@
         </w:rPr>
         <w:t>EduCheck</w:t>
       </w:r>
-      <w:proofErr w:type="spellEnd"/>
     </w:p>
     <w:p>
       <w:pPr>
@@ -59,15 +57,7 @@
         <w:jc w:val="center"/>
       </w:pPr>
       <w:r>
-        <w:t xml:space="preserve">Capstone Project </w:t>
-      </w:r>
-      <w:proofErr w:type="gramStart"/>
-      <w:r>
-        <w:t>II  ·</w:t>
-      </w:r>
-      <w:proofErr w:type="gramEnd"/>
-      <w:r>
-        <w:t xml:space="preserve">  Methodology: Agile-Kanban</w:t>
+        <w:t xml:space="preserve">Capstone Project II  ·  Methodology: Agile-Kanban</w:t>
       </w:r>
     </w:p>
     <w:p>
@@ -137,17 +127,8 @@
           <w:sz w:val="20"/>
           <w:szCs w:val="20"/>
         </w:rPr>
-        <w:t xml:space="preserve">Aira Jeanelle </w:t>
-      </w:r>
-      <w:proofErr w:type="spellStart"/>
-      <w:r>
-        <w:rPr>
-          <w:sz w:val="20"/>
-          <w:szCs w:val="20"/>
-        </w:rPr>
-        <w:t>Hepana</w:t>
-      </w:r>
-      <w:proofErr w:type="spellEnd"/>
+        <w:t xml:space="preserve">Aira Jeanelle Hepana</w:t>
+      </w:r>
     </w:p>
     <w:p>
       <w:pPr>
@@ -172,74 +153,19 @@
           <w:sz w:val="20"/>
           <w:szCs w:val="20"/>
         </w:rPr>
-        <w:t xml:space="preserve">Adviser: Engr. Roselyn A. </w:t>
-      </w:r>
-      <w:proofErr w:type="spellStart"/>
+        <w:t xml:space="preserve">Adviser: Engr. Roselyn A. Maaño &amp; Donabell Hernandez</w:t>
+      </w:r>
+    </w:p>
+    <w:p>
+      <w:pPr>
+        <w:jc w:val="center"/>
+      </w:pPr>
       <w:r>
         <w:rPr>
           <w:sz w:val="20"/>
           <w:szCs w:val="20"/>
         </w:rPr>
-        <w:t>Maaño</w:t>
-      </w:r>
-      <w:proofErr w:type="spellEnd"/>
-      <w:r>
-        <w:rPr>
-          <w:sz w:val="20"/>
-          <w:szCs w:val="20"/>
-        </w:rPr>
-        <w:t xml:space="preserve"> &amp; </w:t>
-      </w:r>
-      <w:proofErr w:type="spellStart"/>
-      <w:r>
-        <w:rPr>
-          <w:sz w:val="20"/>
-          <w:szCs w:val="20"/>
-        </w:rPr>
-        <w:t>Dona</w:t>
-      </w:r>
-      <w:r>
-        <w:rPr>
-          <w:sz w:val="20"/>
-          <w:szCs w:val="20"/>
-        </w:rPr>
-        <w:t>bell</w:t>
-      </w:r>
-      <w:proofErr w:type="spellEnd"/>
-      <w:r>
-        <w:rPr>
-          <w:sz w:val="20"/>
-          <w:szCs w:val="20"/>
-        </w:rPr>
-        <w:t xml:space="preserve"> Hernandez</w:t>
-      </w:r>
-    </w:p>
-    <w:p>
-      <w:pPr>
-        <w:jc w:val="center"/>
-      </w:pPr>
-      <w:r>
-        <w:rPr>
-          <w:sz w:val="20"/>
-          <w:szCs w:val="20"/>
-        </w:rPr>
-        <w:t xml:space="preserve">BS Information </w:t>
-      </w:r>
-      <w:proofErr w:type="gramStart"/>
-      <w:r>
-        <w:rPr>
-          <w:sz w:val="20"/>
-          <w:szCs w:val="20"/>
-        </w:rPr>
-        <w:t>Technology  ·</w:t>
-      </w:r>
-      <w:proofErr w:type="gramEnd"/>
-      <w:r>
-        <w:rPr>
-          <w:sz w:val="20"/>
-          <w:szCs w:val="20"/>
-        </w:rPr>
-        <w:t xml:space="preserve">  2026</w:t>
+        <w:t xml:space="preserve">BS Information Technology  ·  2026</w:t>
       </w:r>
     </w:p>
     <w:p>
@@ -277,11 +203,7 @@
           </w:pPr>
           <w:r>
             <w:fldChar w:fldCharType="begin"/>
-          </w:r>
-          <w:r>
             <w:instrText>TOC \h \o "1-2"</w:instrText>
-          </w:r>
-          <w:r>
             <w:fldChar w:fldCharType="separate"/>
           </w:r>
           <w:hyperlink w:anchor="_Toc239847176" w:history="1">
@@ -297,40 +219,10 @@
                 <w:noProof/>
               </w:rPr>
               <w:tab/>
-            </w:r>
-            <w:r>
-              <w:rPr>
-                <w:noProof/>
-              </w:rPr>
               <w:fldChar w:fldCharType="begin"/>
-            </w:r>
-            <w:r>
-              <w:rPr>
-                <w:noProof/>
-              </w:rPr>
               <w:instrText xml:space="preserve"> PAGEREF _Toc239847176 \h </w:instrText>
-            </w:r>
-            <w:r>
-              <w:rPr>
-                <w:noProof/>
-              </w:rPr>
-            </w:r>
-            <w:r>
-              <w:rPr>
-                <w:noProof/>
-              </w:rPr>
               <w:fldChar w:fldCharType="separate"/>
-            </w:r>
-            <w:r>
-              <w:rPr>
-                <w:noProof/>
-              </w:rPr>
               <w:t>2</w:t>
-            </w:r>
-            <w:r>
-              <w:rPr>
-                <w:noProof/>
-              </w:rPr>
               <w:fldChar w:fldCharType="end"/>
             </w:r>
           </w:hyperlink>
@@ -358,40 +250,10 @@
                 <w:noProof/>
               </w:rPr>
               <w:tab/>
-            </w:r>
-            <w:r>
-              <w:rPr>
-                <w:noProof/>
-              </w:rPr>
               <w:fldChar w:fldCharType="begin"/>
-            </w:r>
-            <w:r>
-              <w:rPr>
-                <w:noProof/>
-              </w:rPr>
               <w:instrText xml:space="preserve"> PAGEREF _Toc239847177 \h </w:instrText>
-            </w:r>
-            <w:r>
-              <w:rPr>
-                <w:noProof/>
-              </w:rPr>
-            </w:r>
-            <w:r>
-              <w:rPr>
-                <w:noProof/>
-              </w:rPr>
               <w:fldChar w:fldCharType="separate"/>
-            </w:r>
-            <w:r>
-              <w:rPr>
-                <w:noProof/>
-              </w:rPr>
               <w:t>4</w:t>
-            </w:r>
-            <w:r>
-              <w:rPr>
-                <w:noProof/>
-              </w:rPr>
               <w:fldChar w:fldCharType="end"/>
             </w:r>
           </w:hyperlink>
@@ -419,40 +281,10 @@
                 <w:noProof/>
               </w:rPr>
               <w:tab/>
-            </w:r>
-            <w:r>
-              <w:rPr>
-                <w:noProof/>
-              </w:rPr>
               <w:fldChar w:fldCharType="begin"/>
-            </w:r>
-            <w:r>
-              <w:rPr>
-                <w:noProof/>
-              </w:rPr>
               <w:instrText xml:space="preserve"> PAGEREF _Toc239847178 \h </w:instrText>
-            </w:r>
-            <w:r>
-              <w:rPr>
-                <w:noProof/>
-              </w:rPr>
-            </w:r>
-            <w:r>
-              <w:rPr>
-                <w:noProof/>
-              </w:rPr>
               <w:fldChar w:fldCharType="separate"/>
-            </w:r>
-            <w:r>
-              <w:rPr>
-                <w:noProof/>
-              </w:rPr>
               <w:t>4</w:t>
-            </w:r>
-            <w:r>
-              <w:rPr>
-                <w:noProof/>
-              </w:rPr>
               <w:fldChar w:fldCharType="end"/>
             </w:r>
           </w:hyperlink>
@@ -480,40 +312,10 @@
                 <w:noProof/>
               </w:rPr>
               <w:tab/>
-            </w:r>
-            <w:r>
-              <w:rPr>
-                <w:noProof/>
-              </w:rPr>
               <w:fldChar w:fldCharType="begin"/>
-            </w:r>
-            <w:r>
-              <w:rPr>
-                <w:noProof/>
-              </w:rPr>
               <w:instrText xml:space="preserve"> PAGEREF _Toc239847179 \h </w:instrText>
-            </w:r>
-            <w:r>
-              <w:rPr>
-                <w:noProof/>
-              </w:rPr>
-            </w:r>
-            <w:r>
-              <w:rPr>
-                <w:noProof/>
-              </w:rPr>
               <w:fldChar w:fldCharType="separate"/>
-            </w:r>
-            <w:r>
-              <w:rPr>
-                <w:noProof/>
-              </w:rPr>
               <w:t>4</w:t>
-            </w:r>
-            <w:r>
-              <w:rPr>
-                <w:noProof/>
-              </w:rPr>
               <w:fldChar w:fldCharType="end"/>
             </w:r>
           </w:hyperlink>
@@ -541,40 +343,10 @@
                 <w:noProof/>
               </w:rPr>
               <w:tab/>
-            </w:r>
-            <w:r>
-              <w:rPr>
-                <w:noProof/>
-              </w:rPr>
               <w:fldChar w:fldCharType="begin"/>
-            </w:r>
-            <w:r>
-              <w:rPr>
-                <w:noProof/>
-              </w:rPr>
               <w:instrText xml:space="preserve"> PAGEREF _Toc239847180 \h </w:instrText>
-            </w:r>
-            <w:r>
-              <w:rPr>
-                <w:noProof/>
-              </w:rPr>
-            </w:r>
-            <w:r>
-              <w:rPr>
-                <w:noProof/>
-              </w:rPr>
               <w:fldChar w:fldCharType="separate"/>
-            </w:r>
-            <w:r>
-              <w:rPr>
-                <w:noProof/>
-              </w:rPr>
               <w:t>4</w:t>
-            </w:r>
-            <w:r>
-              <w:rPr>
-                <w:noProof/>
-              </w:rPr>
               <w:fldChar w:fldCharType="end"/>
             </w:r>
           </w:hyperlink>
@@ -602,40 +374,10 @@
                 <w:noProof/>
               </w:rPr>
               <w:tab/>
-            </w:r>
-            <w:r>
-              <w:rPr>
-                <w:noProof/>
-              </w:rPr>
               <w:fldChar w:fldCharType="begin"/>
-            </w:r>
-            <w:r>
-              <w:rPr>
-                <w:noProof/>
-              </w:rPr>
               <w:instrText xml:space="preserve"> PAGEREF _Toc239847181 \h </w:instrText>
-            </w:r>
-            <w:r>
-              <w:rPr>
-                <w:noProof/>
-              </w:rPr>
-            </w:r>
-            <w:r>
-              <w:rPr>
-                <w:noProof/>
-              </w:rPr>
               <w:fldChar w:fldCharType="separate"/>
-            </w:r>
-            <w:r>
-              <w:rPr>
-                <w:noProof/>
-              </w:rPr>
               <w:t>4</w:t>
-            </w:r>
-            <w:r>
-              <w:rPr>
-                <w:noProof/>
-              </w:rPr>
               <w:fldChar w:fldCharType="end"/>
             </w:r>
           </w:hyperlink>
@@ -663,40 +405,10 @@
                 <w:noProof/>
               </w:rPr>
               <w:tab/>
-            </w:r>
-            <w:r>
-              <w:rPr>
-                <w:noProof/>
-              </w:rPr>
               <w:fldChar w:fldCharType="begin"/>
-            </w:r>
-            <w:r>
-              <w:rPr>
-                <w:noProof/>
-              </w:rPr>
               <w:instrText xml:space="preserve"> PAGEREF _Toc239847182 \h </w:instrText>
-            </w:r>
-            <w:r>
-              <w:rPr>
-                <w:noProof/>
-              </w:rPr>
-            </w:r>
-            <w:r>
-              <w:rPr>
-                <w:noProof/>
-              </w:rPr>
               <w:fldChar w:fldCharType="separate"/>
-            </w:r>
-            <w:r>
-              <w:rPr>
-                <w:noProof/>
-              </w:rPr>
               <w:t>5</w:t>
-            </w:r>
-            <w:r>
-              <w:rPr>
-                <w:noProof/>
-              </w:rPr>
               <w:fldChar w:fldCharType="end"/>
             </w:r>
           </w:hyperlink>
@@ -724,40 +436,10 @@
                 <w:noProof/>
               </w:rPr>
               <w:tab/>
-            </w:r>
-            <w:r>
-              <w:rPr>
-                <w:noProof/>
-              </w:rPr>
               <w:fldChar w:fldCharType="begin"/>
-            </w:r>
-            <w:r>
-              <w:rPr>
-                <w:noProof/>
-              </w:rPr>
               <w:instrText xml:space="preserve"> PAGEREF _Toc239847183 \h </w:instrText>
-            </w:r>
-            <w:r>
-              <w:rPr>
-                <w:noProof/>
-              </w:rPr>
-            </w:r>
-            <w:r>
-              <w:rPr>
-                <w:noProof/>
-              </w:rPr>
               <w:fldChar w:fldCharType="separate"/>
-            </w:r>
-            <w:r>
-              <w:rPr>
-                <w:noProof/>
-              </w:rPr>
               <w:t>5</w:t>
-            </w:r>
-            <w:r>
-              <w:rPr>
-                <w:noProof/>
-              </w:rPr>
               <w:fldChar w:fldCharType="end"/>
             </w:r>
           </w:hyperlink>
@@ -785,40 +467,10 @@
                 <w:noProof/>
               </w:rPr>
               <w:tab/>
-            </w:r>
-            <w:r>
-              <w:rPr>
-                <w:noProof/>
-              </w:rPr>
               <w:fldChar w:fldCharType="begin"/>
-            </w:r>
-            <w:r>
-              <w:rPr>
-                <w:noProof/>
-              </w:rPr>
               <w:instrText xml:space="preserve"> PAGEREF _Toc239847184 \h </w:instrText>
-            </w:r>
-            <w:r>
-              <w:rPr>
-                <w:noProof/>
-              </w:rPr>
-            </w:r>
-            <w:r>
-              <w:rPr>
-                <w:noProof/>
-              </w:rPr>
               <w:fldChar w:fldCharType="separate"/>
-            </w:r>
-            <w:r>
-              <w:rPr>
-                <w:noProof/>
-              </w:rPr>
               <w:t>5</w:t>
-            </w:r>
-            <w:r>
-              <w:rPr>
-                <w:noProof/>
-              </w:rPr>
               <w:fldChar w:fldCharType="end"/>
             </w:r>
           </w:hyperlink>
@@ -846,40 +498,10 @@
                 <w:noProof/>
               </w:rPr>
               <w:tab/>
-            </w:r>
-            <w:r>
-              <w:rPr>
-                <w:noProof/>
-              </w:rPr>
               <w:fldChar w:fldCharType="begin"/>
-            </w:r>
-            <w:r>
-              <w:rPr>
-                <w:noProof/>
-              </w:rPr>
               <w:instrText xml:space="preserve"> PAGEREF _Toc239847185 \h </w:instrText>
-            </w:r>
-            <w:r>
-              <w:rPr>
-                <w:noProof/>
-              </w:rPr>
-            </w:r>
-            <w:r>
-              <w:rPr>
-                <w:noProof/>
-              </w:rPr>
               <w:fldChar w:fldCharType="separate"/>
-            </w:r>
-            <w:r>
-              <w:rPr>
-                <w:noProof/>
-              </w:rPr>
               <w:t>6</w:t>
-            </w:r>
-            <w:r>
-              <w:rPr>
-                <w:noProof/>
-              </w:rPr>
               <w:fldChar w:fldCharType="end"/>
             </w:r>
           </w:hyperlink>
@@ -907,40 +529,10 @@
                 <w:noProof/>
               </w:rPr>
               <w:tab/>
-            </w:r>
-            <w:r>
-              <w:rPr>
-                <w:noProof/>
-              </w:rPr>
               <w:fldChar w:fldCharType="begin"/>
-            </w:r>
-            <w:r>
-              <w:rPr>
-                <w:noProof/>
-              </w:rPr>
               <w:instrText xml:space="preserve"> PAGEREF _Toc239847186 \h </w:instrText>
-            </w:r>
-            <w:r>
-              <w:rPr>
-                <w:noProof/>
-              </w:rPr>
-            </w:r>
-            <w:r>
-              <w:rPr>
-                <w:noProof/>
-              </w:rPr>
               <w:fldChar w:fldCharType="separate"/>
-            </w:r>
-            <w:r>
-              <w:rPr>
-                <w:noProof/>
-              </w:rPr>
               <w:t>7</w:t>
-            </w:r>
-            <w:r>
-              <w:rPr>
-                <w:noProof/>
-              </w:rPr>
               <w:fldChar w:fldCharType="end"/>
             </w:r>
           </w:hyperlink>
@@ -968,40 +560,10 @@
                 <w:noProof/>
               </w:rPr>
               <w:tab/>
-            </w:r>
-            <w:r>
-              <w:rPr>
-                <w:noProof/>
-              </w:rPr>
               <w:fldChar w:fldCharType="begin"/>
-            </w:r>
-            <w:r>
-              <w:rPr>
-                <w:noProof/>
-              </w:rPr>
               <w:instrText xml:space="preserve"> PAGEREF _Toc239847187 \h </w:instrText>
-            </w:r>
-            <w:r>
-              <w:rPr>
-                <w:noProof/>
-              </w:rPr>
-            </w:r>
-            <w:r>
-              <w:rPr>
-                <w:noProof/>
-              </w:rPr>
               <w:fldChar w:fldCharType="separate"/>
-            </w:r>
-            <w:r>
-              <w:rPr>
-                <w:noProof/>
-              </w:rPr>
               <w:t>8</w:t>
-            </w:r>
-            <w:r>
-              <w:rPr>
-                <w:noProof/>
-              </w:rPr>
               <w:fldChar w:fldCharType="end"/>
             </w:r>
           </w:hyperlink>
@@ -1029,40 +591,10 @@
                 <w:noProof/>
               </w:rPr>
               <w:tab/>
-            </w:r>
-            <w:r>
-              <w:rPr>
-                <w:noProof/>
-              </w:rPr>
               <w:fldChar w:fldCharType="begin"/>
-            </w:r>
-            <w:r>
-              <w:rPr>
-                <w:noProof/>
-              </w:rPr>
               <w:instrText xml:space="preserve"> PAGEREF _Toc239847188 \h </w:instrText>
-            </w:r>
-            <w:r>
-              <w:rPr>
-                <w:noProof/>
-              </w:rPr>
-            </w:r>
-            <w:r>
-              <w:rPr>
-                <w:noProof/>
-              </w:rPr>
               <w:fldChar w:fldCharType="separate"/>
-            </w:r>
-            <w:r>
-              <w:rPr>
-                <w:noProof/>
-              </w:rPr>
               <w:t>8</w:t>
-            </w:r>
-            <w:r>
-              <w:rPr>
-                <w:noProof/>
-              </w:rPr>
               <w:fldChar w:fldCharType="end"/>
             </w:r>
           </w:hyperlink>
@@ -1090,40 +622,10 @@
                 <w:noProof/>
               </w:rPr>
               <w:tab/>
-            </w:r>
-            <w:r>
-              <w:rPr>
-                <w:noProof/>
-              </w:rPr>
               <w:fldChar w:fldCharType="begin"/>
-            </w:r>
-            <w:r>
-              <w:rPr>
-                <w:noProof/>
-              </w:rPr>
               <w:instrText xml:space="preserve"> PAGEREF _Toc239847189 \h </w:instrText>
-            </w:r>
-            <w:r>
-              <w:rPr>
-                <w:noProof/>
-              </w:rPr>
-            </w:r>
-            <w:r>
-              <w:rPr>
-                <w:noProof/>
-              </w:rPr>
               <w:fldChar w:fldCharType="separate"/>
-            </w:r>
-            <w:r>
-              <w:rPr>
-                <w:noProof/>
-              </w:rPr>
               <w:t>8</w:t>
-            </w:r>
-            <w:r>
-              <w:rPr>
-                <w:noProof/>
-              </w:rPr>
               <w:fldChar w:fldCharType="end"/>
             </w:r>
           </w:hyperlink>
@@ -1151,40 +653,10 @@
                 <w:noProof/>
               </w:rPr>
               <w:tab/>
-            </w:r>
-            <w:r>
-              <w:rPr>
-                <w:noProof/>
-              </w:rPr>
               <w:fldChar w:fldCharType="begin"/>
-            </w:r>
-            <w:r>
-              <w:rPr>
-                <w:noProof/>
-              </w:rPr>
               <w:instrText xml:space="preserve"> PAGEREF _Toc239847190 \h </w:instrText>
-            </w:r>
-            <w:r>
-              <w:rPr>
-                <w:noProof/>
-              </w:rPr>
-            </w:r>
-            <w:r>
-              <w:rPr>
-                <w:noProof/>
-              </w:rPr>
               <w:fldChar w:fldCharType="separate"/>
-            </w:r>
-            <w:r>
-              <w:rPr>
-                <w:noProof/>
-              </w:rPr>
               <w:t>9</w:t>
-            </w:r>
-            <w:r>
-              <w:rPr>
-                <w:noProof/>
-              </w:rPr>
               <w:fldChar w:fldCharType="end"/>
             </w:r>
           </w:hyperlink>
@@ -1212,40 +684,10 @@
                 <w:noProof/>
               </w:rPr>
               <w:tab/>
-            </w:r>
-            <w:r>
-              <w:rPr>
-                <w:noProof/>
-              </w:rPr>
               <w:fldChar w:fldCharType="begin"/>
-            </w:r>
-            <w:r>
-              <w:rPr>
-                <w:noProof/>
-              </w:rPr>
               <w:instrText xml:space="preserve"> PAGEREF _Toc239847191 \h </w:instrText>
-            </w:r>
-            <w:r>
-              <w:rPr>
-                <w:noProof/>
-              </w:rPr>
-            </w:r>
-            <w:r>
-              <w:rPr>
-                <w:noProof/>
-              </w:rPr>
               <w:fldChar w:fldCharType="separate"/>
-            </w:r>
-            <w:r>
-              <w:rPr>
-                <w:noProof/>
-              </w:rPr>
               <w:t>9</w:t>
-            </w:r>
-            <w:r>
-              <w:rPr>
-                <w:noProof/>
-              </w:rPr>
               <w:fldChar w:fldCharType="end"/>
             </w:r>
           </w:hyperlink>
@@ -1273,40 +715,10 @@
                 <w:noProof/>
               </w:rPr>
               <w:tab/>
-            </w:r>
-            <w:r>
-              <w:rPr>
-                <w:noProof/>
-              </w:rPr>
               <w:fldChar w:fldCharType="begin"/>
-            </w:r>
-            <w:r>
-              <w:rPr>
-                <w:noProof/>
-              </w:rPr>
               <w:instrText xml:space="preserve"> PAGEREF _Toc239847192 \h </w:instrText>
-            </w:r>
-            <w:r>
-              <w:rPr>
-                <w:noProof/>
-              </w:rPr>
-            </w:r>
-            <w:r>
-              <w:rPr>
-                <w:noProof/>
-              </w:rPr>
               <w:fldChar w:fldCharType="separate"/>
-            </w:r>
-            <w:r>
-              <w:rPr>
-                <w:noProof/>
-              </w:rPr>
               <w:t>10</w:t>
-            </w:r>
-            <w:r>
-              <w:rPr>
-                <w:noProof/>
-              </w:rPr>
               <w:fldChar w:fldCharType="end"/>
             </w:r>
           </w:hyperlink>
@@ -1334,40 +746,10 @@
                 <w:noProof/>
               </w:rPr>
               <w:tab/>
-            </w:r>
-            <w:r>
-              <w:rPr>
-                <w:noProof/>
-              </w:rPr>
               <w:fldChar w:fldCharType="begin"/>
-            </w:r>
-            <w:r>
-              <w:rPr>
-                <w:noProof/>
-              </w:rPr>
               <w:instrText xml:space="preserve"> PAGEREF _Toc239847193 \h </w:instrText>
-            </w:r>
-            <w:r>
-              <w:rPr>
-                <w:noProof/>
-              </w:rPr>
-            </w:r>
-            <w:r>
-              <w:rPr>
-                <w:noProof/>
-              </w:rPr>
               <w:fldChar w:fldCharType="separate"/>
-            </w:r>
-            <w:r>
-              <w:rPr>
-                <w:noProof/>
-              </w:rPr>
               <w:t>11</w:t>
-            </w:r>
-            <w:r>
-              <w:rPr>
-                <w:noProof/>
-              </w:rPr>
               <w:fldChar w:fldCharType="end"/>
             </w:r>
           </w:hyperlink>
@@ -1395,40 +777,10 @@
                 <w:noProof/>
               </w:rPr>
               <w:tab/>
-            </w:r>
-            <w:r>
-              <w:rPr>
-                <w:noProof/>
-              </w:rPr>
               <w:fldChar w:fldCharType="begin"/>
-            </w:r>
-            <w:r>
-              <w:rPr>
-                <w:noProof/>
-              </w:rPr>
               <w:instrText xml:space="preserve"> PAGEREF _Toc239847194 \h </w:instrText>
-            </w:r>
-            <w:r>
-              <w:rPr>
-                <w:noProof/>
-              </w:rPr>
-            </w:r>
-            <w:r>
-              <w:rPr>
-                <w:noProof/>
-              </w:rPr>
               <w:fldChar w:fldCharType="separate"/>
-            </w:r>
-            <w:r>
-              <w:rPr>
-                <w:noProof/>
-              </w:rPr>
               <w:t>11</w:t>
-            </w:r>
-            <w:r>
-              <w:rPr>
-                <w:noProof/>
-              </w:rPr>
               <w:fldChar w:fldCharType="end"/>
             </w:r>
           </w:hyperlink>
@@ -1456,40 +808,10 @@
                 <w:noProof/>
               </w:rPr>
               <w:tab/>
-            </w:r>
-            <w:r>
-              <w:rPr>
-                <w:noProof/>
-              </w:rPr>
               <w:fldChar w:fldCharType="begin"/>
-            </w:r>
-            <w:r>
-              <w:rPr>
-                <w:noProof/>
-              </w:rPr>
               <w:instrText xml:space="preserve"> PAGEREF _Toc239847195 \h </w:instrText>
-            </w:r>
-            <w:r>
-              <w:rPr>
-                <w:noProof/>
-              </w:rPr>
-            </w:r>
-            <w:r>
-              <w:rPr>
-                <w:noProof/>
-              </w:rPr>
               <w:fldChar w:fldCharType="separate"/>
-            </w:r>
-            <w:r>
-              <w:rPr>
-                <w:noProof/>
-              </w:rPr>
               <w:t>12</w:t>
-            </w:r>
-            <w:r>
-              <w:rPr>
-                <w:noProof/>
-              </w:rPr>
               <w:fldChar w:fldCharType="end"/>
             </w:r>
           </w:hyperlink>
@@ -1517,40 +839,10 @@
                 <w:noProof/>
               </w:rPr>
               <w:tab/>
-            </w:r>
-            <w:r>
-              <w:rPr>
-                <w:noProof/>
-              </w:rPr>
               <w:fldChar w:fldCharType="begin"/>
-            </w:r>
-            <w:r>
-              <w:rPr>
-                <w:noProof/>
-              </w:rPr>
               <w:instrText xml:space="preserve"> PAGEREF _Toc239847196 \h </w:instrText>
-            </w:r>
-            <w:r>
-              <w:rPr>
-                <w:noProof/>
-              </w:rPr>
-            </w:r>
-            <w:r>
-              <w:rPr>
-                <w:noProof/>
-              </w:rPr>
               <w:fldChar w:fldCharType="separate"/>
-            </w:r>
-            <w:r>
-              <w:rPr>
-                <w:noProof/>
-              </w:rPr>
               <w:t>12</w:t>
-            </w:r>
-            <w:r>
-              <w:rPr>
-                <w:noProof/>
-              </w:rPr>
               <w:fldChar w:fldCharType="end"/>
             </w:r>
           </w:hyperlink>
@@ -1578,40 +870,10 @@
                 <w:noProof/>
               </w:rPr>
               <w:tab/>
-            </w:r>
-            <w:r>
-              <w:rPr>
-                <w:noProof/>
-              </w:rPr>
               <w:fldChar w:fldCharType="begin"/>
-            </w:r>
-            <w:r>
-              <w:rPr>
-                <w:noProof/>
-              </w:rPr>
               <w:instrText xml:space="preserve"> PAGEREF _Toc239847197 \h </w:instrText>
-            </w:r>
-            <w:r>
-              <w:rPr>
-                <w:noProof/>
-              </w:rPr>
-            </w:r>
-            <w:r>
-              <w:rPr>
-                <w:noProof/>
-              </w:rPr>
               <w:fldChar w:fldCharType="separate"/>
-            </w:r>
-            <w:r>
-              <w:rPr>
-                <w:noProof/>
-              </w:rPr>
               <w:t>12</w:t>
-            </w:r>
-            <w:r>
-              <w:rPr>
-                <w:noProof/>
-              </w:rPr>
               <w:fldChar w:fldCharType="end"/>
             </w:r>
           </w:hyperlink>
@@ -1639,40 +901,10 @@
                 <w:noProof/>
               </w:rPr>
               <w:tab/>
-            </w:r>
-            <w:r>
-              <w:rPr>
-                <w:noProof/>
-              </w:rPr>
               <w:fldChar w:fldCharType="begin"/>
-            </w:r>
-            <w:r>
-              <w:rPr>
-                <w:noProof/>
-              </w:rPr>
               <w:instrText xml:space="preserve"> PAGEREF _Toc239847198 \h </w:instrText>
-            </w:r>
-            <w:r>
-              <w:rPr>
-                <w:noProof/>
-              </w:rPr>
-            </w:r>
-            <w:r>
-              <w:rPr>
-                <w:noProof/>
-              </w:rPr>
               <w:fldChar w:fldCharType="separate"/>
-            </w:r>
-            <w:r>
-              <w:rPr>
-                <w:noProof/>
-              </w:rPr>
               <w:t>12</w:t>
-            </w:r>
-            <w:r>
-              <w:rPr>
-                <w:noProof/>
-              </w:rPr>
               <w:fldChar w:fldCharType="end"/>
             </w:r>
           </w:hyperlink>
@@ -1700,40 +932,10 @@
                 <w:noProof/>
               </w:rPr>
               <w:tab/>
-            </w:r>
-            <w:r>
-              <w:rPr>
-                <w:noProof/>
-              </w:rPr>
               <w:fldChar w:fldCharType="begin"/>
-            </w:r>
-            <w:r>
-              <w:rPr>
-                <w:noProof/>
-              </w:rPr>
               <w:instrText xml:space="preserve"> PAGEREF _Toc239847199 \h </w:instrText>
-            </w:r>
-            <w:r>
-              <w:rPr>
-                <w:noProof/>
-              </w:rPr>
-            </w:r>
-            <w:r>
-              <w:rPr>
-                <w:noProof/>
-              </w:rPr>
               <w:fldChar w:fldCharType="separate"/>
-            </w:r>
-            <w:r>
-              <w:rPr>
-                <w:noProof/>
-              </w:rPr>
               <w:t>13</w:t>
-            </w:r>
-            <w:r>
-              <w:rPr>
-                <w:noProof/>
-              </w:rPr>
               <w:fldChar w:fldCharType="end"/>
             </w:r>
           </w:hyperlink>
@@ -1761,40 +963,10 @@
                 <w:noProof/>
               </w:rPr>
               <w:tab/>
-            </w:r>
-            <w:r>
-              <w:rPr>
-                <w:noProof/>
-              </w:rPr>
               <w:fldChar w:fldCharType="begin"/>
-            </w:r>
-            <w:r>
-              <w:rPr>
-                <w:noProof/>
-              </w:rPr>
               <w:instrText xml:space="preserve"> PAGEREF _Toc239847200 \h </w:instrText>
-            </w:r>
-            <w:r>
-              <w:rPr>
-                <w:noProof/>
-              </w:rPr>
-            </w:r>
-            <w:r>
-              <w:rPr>
-                <w:noProof/>
-              </w:rPr>
               <w:fldChar w:fldCharType="separate"/>
-            </w:r>
-            <w:r>
-              <w:rPr>
-                <w:noProof/>
-              </w:rPr>
               <w:t>13</w:t>
-            </w:r>
-            <w:r>
-              <w:rPr>
-                <w:noProof/>
-              </w:rPr>
               <w:fldChar w:fldCharType="end"/>
             </w:r>
           </w:hyperlink>
@@ -1822,40 +994,10 @@
                 <w:noProof/>
               </w:rPr>
               <w:tab/>
-            </w:r>
-            <w:r>
-              <w:rPr>
-                <w:noProof/>
-              </w:rPr>
               <w:fldChar w:fldCharType="begin"/>
-            </w:r>
-            <w:r>
-              <w:rPr>
-                <w:noProof/>
-              </w:rPr>
               <w:instrText xml:space="preserve"> PAGEREF _Toc239847201 \h </w:instrText>
-            </w:r>
-            <w:r>
-              <w:rPr>
-                <w:noProof/>
-              </w:rPr>
-            </w:r>
-            <w:r>
-              <w:rPr>
-                <w:noProof/>
-              </w:rPr>
               <w:fldChar w:fldCharType="separate"/>
-            </w:r>
-            <w:r>
-              <w:rPr>
-                <w:noProof/>
-              </w:rPr>
               <w:t>14</w:t>
-            </w:r>
-            <w:r>
-              <w:rPr>
-                <w:noProof/>
-              </w:rPr>
               <w:fldChar w:fldCharType="end"/>
             </w:r>
           </w:hyperlink>
@@ -1883,40 +1025,10 @@
                 <w:noProof/>
               </w:rPr>
               <w:tab/>
-            </w:r>
-            <w:r>
-              <w:rPr>
-                <w:noProof/>
-              </w:rPr>
               <w:fldChar w:fldCharType="begin"/>
-            </w:r>
-            <w:r>
-              <w:rPr>
-                <w:noProof/>
-              </w:rPr>
               <w:instrText xml:space="preserve"> PAGEREF _Toc239847202 \h </w:instrText>
-            </w:r>
-            <w:r>
-              <w:rPr>
-                <w:noProof/>
-              </w:rPr>
-            </w:r>
-            <w:r>
-              <w:rPr>
-                <w:noProof/>
-              </w:rPr>
               <w:fldChar w:fldCharType="separate"/>
-            </w:r>
-            <w:r>
-              <w:rPr>
-                <w:noProof/>
-              </w:rPr>
               <w:t>15</w:t>
-            </w:r>
-            <w:r>
-              <w:rPr>
-                <w:noProof/>
-              </w:rPr>
               <w:fldChar w:fldCharType="end"/>
             </w:r>
           </w:hyperlink>
@@ -1944,40 +1056,10 @@
                 <w:noProof/>
               </w:rPr>
               <w:tab/>
-            </w:r>
-            <w:r>
-              <w:rPr>
-                <w:noProof/>
-              </w:rPr>
               <w:fldChar w:fldCharType="begin"/>
-            </w:r>
-            <w:r>
-              <w:rPr>
-                <w:noProof/>
-              </w:rPr>
               <w:instrText xml:space="preserve"> PAGEREF _Toc239847203 \h </w:instrText>
-            </w:r>
-            <w:r>
-              <w:rPr>
-                <w:noProof/>
-              </w:rPr>
-            </w:r>
-            <w:r>
-              <w:rPr>
-                <w:noProof/>
-              </w:rPr>
               <w:fldChar w:fldCharType="separate"/>
-            </w:r>
-            <w:r>
-              <w:rPr>
-                <w:noProof/>
-              </w:rPr>
               <w:t>15</w:t>
-            </w:r>
-            <w:r>
-              <w:rPr>
-                <w:noProof/>
-              </w:rPr>
               <w:fldChar w:fldCharType="end"/>
             </w:r>
           </w:hyperlink>
@@ -2005,40 +1087,10 @@
                 <w:noProof/>
               </w:rPr>
               <w:tab/>
-            </w:r>
-            <w:r>
-              <w:rPr>
-                <w:noProof/>
-              </w:rPr>
               <w:fldChar w:fldCharType="begin"/>
-            </w:r>
-            <w:r>
-              <w:rPr>
-                <w:noProof/>
-              </w:rPr>
               <w:instrText xml:space="preserve"> PAGEREF _Toc239847204 \h </w:instrText>
-            </w:r>
-            <w:r>
-              <w:rPr>
-                <w:noProof/>
-              </w:rPr>
-            </w:r>
-            <w:r>
-              <w:rPr>
-                <w:noProof/>
-              </w:rPr>
               <w:fldChar w:fldCharType="separate"/>
-            </w:r>
-            <w:r>
-              <w:rPr>
-                <w:noProof/>
-              </w:rPr>
               <w:t>15</w:t>
-            </w:r>
-            <w:r>
-              <w:rPr>
-                <w:noProof/>
-              </w:rPr>
               <w:fldChar w:fldCharType="end"/>
             </w:r>
           </w:hyperlink>
@@ -2066,40 +1118,10 @@
                 <w:noProof/>
               </w:rPr>
               <w:tab/>
-            </w:r>
-            <w:r>
-              <w:rPr>
-                <w:noProof/>
-              </w:rPr>
               <w:fldChar w:fldCharType="begin"/>
-            </w:r>
-            <w:r>
-              <w:rPr>
-                <w:noProof/>
-              </w:rPr>
               <w:instrText xml:space="preserve"> PAGEREF _Toc239847205 \h </w:instrText>
-            </w:r>
-            <w:r>
-              <w:rPr>
-                <w:noProof/>
-              </w:rPr>
-            </w:r>
-            <w:r>
-              <w:rPr>
-                <w:noProof/>
-              </w:rPr>
               <w:fldChar w:fldCharType="separate"/>
-            </w:r>
-            <w:r>
-              <w:rPr>
-                <w:noProof/>
-              </w:rPr>
               <w:t>15</w:t>
-            </w:r>
-            <w:r>
-              <w:rPr>
-                <w:noProof/>
-              </w:rPr>
               <w:fldChar w:fldCharType="end"/>
             </w:r>
           </w:hyperlink>
@@ -2127,40 +1149,10 @@
                 <w:noProof/>
               </w:rPr>
               <w:tab/>
-            </w:r>
-            <w:r>
-              <w:rPr>
-                <w:noProof/>
-              </w:rPr>
               <w:fldChar w:fldCharType="begin"/>
-            </w:r>
-            <w:r>
-              <w:rPr>
-                <w:noProof/>
-              </w:rPr>
               <w:instrText xml:space="preserve"> PAGEREF _Toc239847206 \h </w:instrText>
-            </w:r>
-            <w:r>
-              <w:rPr>
-                <w:noProof/>
-              </w:rPr>
-            </w:r>
-            <w:r>
-              <w:rPr>
-                <w:noProof/>
-              </w:rPr>
               <w:fldChar w:fldCharType="separate"/>
-            </w:r>
-            <w:r>
-              <w:rPr>
-                <w:noProof/>
-              </w:rPr>
               <w:t>16</w:t>
-            </w:r>
-            <w:r>
-              <w:rPr>
-                <w:noProof/>
-              </w:rPr>
               <w:fldChar w:fldCharType="end"/>
             </w:r>
           </w:hyperlink>
@@ -2188,40 +1180,10 @@
                 <w:noProof/>
               </w:rPr>
               <w:tab/>
-            </w:r>
-            <w:r>
-              <w:rPr>
-                <w:noProof/>
-              </w:rPr>
               <w:fldChar w:fldCharType="begin"/>
-            </w:r>
-            <w:r>
-              <w:rPr>
-                <w:noProof/>
-              </w:rPr>
               <w:instrText xml:space="preserve"> PAGEREF _Toc239847207 \h </w:instrText>
-            </w:r>
-            <w:r>
-              <w:rPr>
-                <w:noProof/>
-              </w:rPr>
-            </w:r>
-            <w:r>
-              <w:rPr>
-                <w:noProof/>
-              </w:rPr>
               <w:fldChar w:fldCharType="separate"/>
-            </w:r>
-            <w:r>
-              <w:rPr>
-                <w:noProof/>
-              </w:rPr>
               <w:t>16</w:t>
-            </w:r>
-            <w:r>
-              <w:rPr>
-                <w:noProof/>
-              </w:rPr>
               <w:fldChar w:fldCharType="end"/>
             </w:r>
           </w:hyperlink>
@@ -2249,40 +1211,10 @@
                 <w:noProof/>
               </w:rPr>
               <w:tab/>
-            </w:r>
-            <w:r>
-              <w:rPr>
-                <w:noProof/>
-              </w:rPr>
               <w:fldChar w:fldCharType="begin"/>
-            </w:r>
-            <w:r>
-              <w:rPr>
-                <w:noProof/>
-              </w:rPr>
               <w:instrText xml:space="preserve"> PAGEREF _Toc239847208 \h </w:instrText>
-            </w:r>
-            <w:r>
-              <w:rPr>
-                <w:noProof/>
-              </w:rPr>
-            </w:r>
-            <w:r>
-              <w:rPr>
-                <w:noProof/>
-              </w:rPr>
               <w:fldChar w:fldCharType="separate"/>
-            </w:r>
-            <w:r>
-              <w:rPr>
-                <w:noProof/>
-              </w:rPr>
               <w:t>16</w:t>
-            </w:r>
-            <w:r>
-              <w:rPr>
-                <w:noProof/>
-              </w:rPr>
               <w:fldChar w:fldCharType="end"/>
             </w:r>
           </w:hyperlink>
@@ -2310,40 +1242,10 @@
                 <w:noProof/>
               </w:rPr>
               <w:tab/>
-            </w:r>
-            <w:r>
-              <w:rPr>
-                <w:noProof/>
-              </w:rPr>
               <w:fldChar w:fldCharType="begin"/>
-            </w:r>
-            <w:r>
-              <w:rPr>
-                <w:noProof/>
-              </w:rPr>
               <w:instrText xml:space="preserve"> PAGEREF _Toc239847209 \h </w:instrText>
-            </w:r>
-            <w:r>
-              <w:rPr>
-                <w:noProof/>
-              </w:rPr>
-            </w:r>
-            <w:r>
-              <w:rPr>
-                <w:noProof/>
-              </w:rPr>
               <w:fldChar w:fldCharType="separate"/>
-            </w:r>
-            <w:r>
-              <w:rPr>
-                <w:noProof/>
-              </w:rPr>
               <w:t>16</w:t>
-            </w:r>
-            <w:r>
-              <w:rPr>
-                <w:noProof/>
-              </w:rPr>
               <w:fldChar w:fldCharType="end"/>
             </w:r>
           </w:hyperlink>
@@ -2371,40 +1273,10 @@
                 <w:noProof/>
               </w:rPr>
               <w:tab/>
-            </w:r>
-            <w:r>
-              <w:rPr>
-                <w:noProof/>
-              </w:rPr>
               <w:fldChar w:fldCharType="begin"/>
-            </w:r>
-            <w:r>
-              <w:rPr>
-                <w:noProof/>
-              </w:rPr>
               <w:instrText xml:space="preserve"> PAGEREF _Toc239847210 \h </w:instrText>
-            </w:r>
-            <w:r>
-              <w:rPr>
-                <w:noProof/>
-              </w:rPr>
-            </w:r>
-            <w:r>
-              <w:rPr>
-                <w:noProof/>
-              </w:rPr>
               <w:fldChar w:fldCharType="separate"/>
-            </w:r>
-            <w:r>
-              <w:rPr>
-                <w:noProof/>
-              </w:rPr>
               <w:t>16</w:t>
-            </w:r>
-            <w:r>
-              <w:rPr>
-                <w:noProof/>
-              </w:rPr>
               <w:fldChar w:fldCharType="end"/>
             </w:r>
           </w:hyperlink>
@@ -2432,40 +1304,10 @@
                 <w:noProof/>
               </w:rPr>
               <w:tab/>
-            </w:r>
-            <w:r>
-              <w:rPr>
-                <w:noProof/>
-              </w:rPr>
               <w:fldChar w:fldCharType="begin"/>
-            </w:r>
-            <w:r>
-              <w:rPr>
-                <w:noProof/>
-              </w:rPr>
               <w:instrText xml:space="preserve"> PAGEREF _Toc239847211 \h </w:instrText>
-            </w:r>
-            <w:r>
-              <w:rPr>
-                <w:noProof/>
-              </w:rPr>
-            </w:r>
-            <w:r>
-              <w:rPr>
-                <w:noProof/>
-              </w:rPr>
               <w:fldChar w:fldCharType="separate"/>
-            </w:r>
-            <w:r>
-              <w:rPr>
-                <w:noProof/>
-              </w:rPr>
               <w:t>17</w:t>
-            </w:r>
-            <w:r>
-              <w:rPr>
-                <w:noProof/>
-              </w:rPr>
               <w:fldChar w:fldCharType="end"/>
             </w:r>
           </w:hyperlink>
@@ -2493,40 +1335,10 @@
                 <w:noProof/>
               </w:rPr>
               <w:tab/>
-            </w:r>
-            <w:r>
-              <w:rPr>
-                <w:noProof/>
-              </w:rPr>
               <w:fldChar w:fldCharType="begin"/>
-            </w:r>
-            <w:r>
-              <w:rPr>
-                <w:noProof/>
-              </w:rPr>
               <w:instrText xml:space="preserve"> PAGEREF _Toc239847212 \h </w:instrText>
-            </w:r>
-            <w:r>
-              <w:rPr>
-                <w:noProof/>
-              </w:rPr>
-            </w:r>
-            <w:r>
-              <w:rPr>
-                <w:noProof/>
-              </w:rPr>
               <w:fldChar w:fldCharType="separate"/>
-            </w:r>
-            <w:r>
-              <w:rPr>
-                <w:noProof/>
-              </w:rPr>
               <w:t>17</w:t>
-            </w:r>
-            <w:r>
-              <w:rPr>
-                <w:noProof/>
-              </w:rPr>
               <w:fldChar w:fldCharType="end"/>
             </w:r>
           </w:hyperlink>
@@ -2558,21 +1370,8 @@
       <w:pPr>
         <w:spacing w:after="160" w:line="276" w:lineRule="auto"/>
       </w:pPr>
-      <w:proofErr w:type="spellStart"/>
-      <w:r>
-        <w:t>EduCheck</w:t>
-      </w:r>
-      <w:proofErr w:type="spellEnd"/>
-      <w:r>
-        <w:t xml:space="preserve"> is a web and mobile academic record management system designed to modernize the preparation of student permanent records in government elementary schools. The system addresses the repetitive and error-prone process of manually transferring grades from official DepEd e-Class Records into </w:t>
-      </w:r>
-      <w:proofErr w:type="gramStart"/>
-      <w:r>
-        <w:t>the School</w:t>
-      </w:r>
-      <w:proofErr w:type="gramEnd"/>
-      <w:r>
-        <w:t xml:space="preserve"> Form 10 (SF10).</w:t>
+      <w:r>
+        <w:t xml:space="preserve">EduCheck is a web and mobile academic record management system designed to modernize the preparation of student permanent records in government elementary schools. The system addresses the repetitive and error-prone process of manually transferring grades from official DepEd e-Class Records into the School Form 10 (SF10).</w:t>
       </w:r>
     </w:p>
     <w:p>
@@ -2607,21 +1406,8 @@
       <w:pPr>
         <w:spacing w:after="160" w:line="276" w:lineRule="auto"/>
       </w:pPr>
-      <w:proofErr w:type="spellStart"/>
-      <w:r>
-        <w:t>EduCheck</w:t>
-      </w:r>
-      <w:proofErr w:type="spellEnd"/>
-      <w:r>
-        <w:t xml:space="preserve"> aims to modernize the academic record management process in government elementary schools by automating the consolidation, validation, generation, storage, and submission of student permanent records while preserving the existing DepEd e-Class Record workflow. Rather than replacing current grading practices, </w:t>
-      </w:r>
-      <w:proofErr w:type="spellStart"/>
-      <w:r>
-        <w:t>EduCheck</w:t>
-      </w:r>
-      <w:proofErr w:type="spellEnd"/>
-      <w:r>
-        <w:t xml:space="preserve"> enhances them by reducing repetitive manual work, minimizing encoding errors, improving data accuracy, and supporting more efficient academic record management.</w:t>
+      <w:r>
+        <w:t xml:space="preserve">EduCheck aims to modernize the academic record management process in government elementary schools by automating the consolidation, validation, generation, storage, and submission of student permanent records while preserving the existing DepEd e-Class Record workflow. Rather than replacing current grading practices, EduCheck enhances them by reducing repetitive manual work, minimizing encoding errors, improving data accuracy, and supporting more efficient academic record management.</w:t>
       </w:r>
     </w:p>
     <w:p>
@@ -2901,25 +1687,7 @@
                 <w:sz w:val="20"/>
                 <w:szCs w:val="20"/>
               </w:rPr>
-              <w:t xml:space="preserve">For a departmentalized </w:t>
-            </w:r>
-            <w:proofErr w:type="gramStart"/>
-            <w:r>
-              <w:rPr>
-                <w:color w:val="000000"/>
-                <w:sz w:val="20"/>
-                <w:szCs w:val="20"/>
-              </w:rPr>
-              <w:t>section:</w:t>
-            </w:r>
-            <w:proofErr w:type="gramEnd"/>
-            <w:r>
-              <w:rPr>
-                <w:color w:val="000000"/>
-                <w:sz w:val="20"/>
-                <w:szCs w:val="20"/>
-              </w:rPr>
-              <w:t xml:space="preserve"> uploads the official e-Class Record for their assigned subject and section; reviews validation results and fixes flagged entries by correcting the e-Class Record file and re-uploading it, within that subject only. (Assigned per section by the Administrator — not tied to a fixed grade level.)</w:t>
+              <w:t xml:space="preserve">For a departmentalized section: uploads the official e-Class Record for their assigned subject and section; reviews validation results and fixes flagged entries by correcting the e-Class Record file and re-uploading it, within that subject only. (Assigned per section by the Administrator — not tied to a fixed grade level.)</w:t>
             </w:r>
           </w:p>
         </w:tc>
@@ -2968,43 +1736,7 @@
                 <w:sz w:val="20"/>
                 <w:szCs w:val="20"/>
               </w:rPr>
-              <w:t xml:space="preserve">For a self-contained section: uploads e-Class Records for every learning area, since they are the only </w:t>
-            </w:r>
-            <w:proofErr w:type="gramStart"/>
-            <w:r>
-              <w:rPr>
-                <w:color w:val="000000"/>
-                <w:sz w:val="20"/>
-                <w:szCs w:val="20"/>
-              </w:rPr>
-              <w:t>teacher</w:t>
-            </w:r>
-            <w:proofErr w:type="gramEnd"/>
-            <w:r>
-              <w:rPr>
-                <w:color w:val="000000"/>
-                <w:sz w:val="20"/>
-                <w:szCs w:val="20"/>
-              </w:rPr>
-              <w:t xml:space="preserve"> assigned. For a departmentalized </w:t>
-            </w:r>
-            <w:proofErr w:type="gramStart"/>
-            <w:r>
-              <w:rPr>
-                <w:color w:val="000000"/>
-                <w:sz w:val="20"/>
-                <w:szCs w:val="20"/>
-              </w:rPr>
-              <w:t>section:</w:t>
-            </w:r>
-            <w:proofErr w:type="gramEnd"/>
-            <w:r>
-              <w:rPr>
-                <w:color w:val="000000"/>
-                <w:sz w:val="20"/>
-                <w:szCs w:val="20"/>
-              </w:rPr>
-              <w:t xml:space="preserve"> reviews the consolidated record, returns a subject for correction if needed, and submits the section for approval. Whether a section is self-contained or departmentalized is configured per section by the Administrator.</w:t>
+              <w:t xml:space="preserve">For a self-contained section: uploads e-Class Records for every learning area, since they are the only teacher assigned. For a departmentalized section: reviews the consolidated record, returns a subject for correction if needed, and submits the section for approval. Whether a section is self-contained or departmentalized is configured per section by the Administrator.</w:t>
             </w:r>
           </w:p>
         </w:tc>
@@ -3053,7 +1785,7 @@
                 <w:sz w:val="20"/>
                 <w:szCs w:val="20"/>
               </w:rPr>
-              <w:t>Approves or returns submitted class records; manages user accounts and subject/section assignments; oversees the digital repository and the school and SF10 settings.</w:t>
+              <w:t>Approves or returns submitted class records; adds user accounts, which can be used only after the Principal approves them, and manages subject/section assignments; oversees the digital repository and the school and SF10 settings.</w:t>
             </w:r>
           </w:p>
         </w:tc>
@@ -3102,7 +1834,7 @@
                 <w:sz w:val="20"/>
                 <w:szCs w:val="20"/>
               </w:rPr>
-              <w:t>Monitors submission progress, school-wide analytics, and reports across all sections and grade levels (view-only).</w:t>
+              <w:t>Monitors submission progress, school-wide analytics, and reports across all sections and grade levels (view-only), and approves or rejects new user accounts and role changes that give more access.</w:t>
             </w:r>
           </w:p>
         </w:tc>
@@ -3161,13 +1893,8 @@
         </w:numPr>
         <w:spacing w:after="80"/>
       </w:pPr>
-      <w:proofErr w:type="gramStart"/>
-      <w:r>
-        <w:t>Saves</w:t>
-      </w:r>
-      <w:proofErr w:type="gramEnd"/>
-      <w:r>
-        <w:t xml:space="preserve"> time preparing SF10.</w:t>
+      <w:r>
+        <w:t xml:space="preserve">Saves time preparing SF10.</w:t>
       </w:r>
     </w:p>
     <w:p>
@@ -3301,8 +2028,6 @@
       </w:pPr>
       <w:r>
         <w:t xml:space="preserve">Government elementary schools currently use separate official DepEd e-Class Record spreadsheets for each subject. Although these spreadsheets automatically compute grades, teachers still manually </w:t>
-      </w:r>
-      <w:r>
         <w:lastRenderedPageBreak/>
         <w:t>transfer the final grades into individual SF10 permanent records. This manual process is time-consuming, repetitive, and susceptible to human error. Additionally, retrieving student records from multiple files can be inefficient.</w:t>
       </w:r>
@@ -3311,13 +2036,8 @@
       <w:pPr>
         <w:spacing w:after="160" w:line="276" w:lineRule="auto"/>
       </w:pPr>
-      <w:proofErr w:type="spellStart"/>
-      <w:r>
-        <w:t>EduCheck</w:t>
-      </w:r>
-      <w:proofErr w:type="spellEnd"/>
-      <w:r>
-        <w:t xml:space="preserve"> addresses these challenges by preserving the official DepEd workflow while automating record consolidation, validation, SF10 generation, and digital record management — with access to each subject's data restricted to the teacher responsible for it.</w:t>
+      <w:r>
+        <w:t xml:space="preserve">EduCheck addresses these challenges by preserving the official DepEd workflow while automating record consolidation, validation, SF10 generation, and digital record management — with access to each subject's data restricted to the teacher responsible for it.</w:t>
       </w:r>
     </w:p>
     <w:p>
@@ -3541,15 +2261,7 @@
         <w:spacing w:after="80"/>
       </w:pPr>
       <w:r>
-        <w:t xml:space="preserve">Allows authorized users to </w:t>
-      </w:r>
-      <w:proofErr w:type="gramStart"/>
-      <w:r>
-        <w:t>search</w:t>
-      </w:r>
-      <w:proofErr w:type="gramEnd"/>
-      <w:r>
-        <w:t xml:space="preserve"> records by LRN, Student Name, Grade Level, or School Year.</w:t>
+        <w:t xml:space="preserve">Allows authorized users to search records by LRN, Student Name, Grade Level, or School Year.</w:t>
       </w:r>
     </w:p>
     <w:p>
@@ -3591,13 +2303,8 @@
         </w:numPr>
         <w:spacing w:after="80"/>
       </w:pPr>
-      <w:proofErr w:type="gramStart"/>
-      <w:r>
-        <w:t>Restricts</w:t>
-      </w:r>
-      <w:proofErr w:type="gramEnd"/>
-      <w:r>
-        <w:t xml:space="preserve"> each Subject Teacher to their own assigned subject and section.</w:t>
+      <w:r>
+        <w:t xml:space="preserve">Restricts each Subject Teacher to their own assigned subject and section.</w:t>
       </w:r>
     </w:p>
     <w:p>
@@ -3873,15 +2580,7 @@
         <w:pStyle w:val="Heading3"/>
       </w:pPr>
       <w:r>
-        <w:t xml:space="preserve">Proposed </w:t>
-      </w:r>
-      <w:proofErr w:type="spellStart"/>
-      <w:r>
-        <w:t>EduCheck</w:t>
-      </w:r>
-      <w:proofErr w:type="spellEnd"/>
-      <w:r>
-        <w:t xml:space="preserve"> Workflow</w:t>
+        <w:t xml:space="preserve">Proposed EduCheck Workflow</w:t>
       </w:r>
     </w:p>
     <w:p>
@@ -3893,23 +2592,7 @@
           <w:i/>
           <w:iCs/>
         </w:rPr>
-        <w:t xml:space="preserve">Whether a section is Self-Contained or Departmentalized is configured per section by the Administrator, not derived from grade level — the same section-level setting applies however a particular school </w:t>
-      </w:r>
-      <w:proofErr w:type="gramStart"/>
-      <w:r>
-        <w:rPr>
-          <w:i/>
-          <w:iCs/>
-        </w:rPr>
-        <w:t>actually staffs</w:t>
-      </w:r>
-      <w:proofErr w:type="gramEnd"/>
-      <w:r>
-        <w:rPr>
-          <w:i/>
-          <w:iCs/>
-        </w:rPr>
-        <w:t xml:space="preserve"> each grade.</w:t>
+        <w:t xml:space="preserve">Whether a section is Self-Contained or Departmentalized is configured per section by the Administrator, not derived from grade level — the same section-level setting applies however a particular school actually staffs each grade.</w:t>
       </w:r>
     </w:p>
     <w:p>
@@ -4293,7 +2976,7 @@
                 <w:sz w:val="20"/>
                 <w:szCs w:val="20"/>
               </w:rPr>
-              <w:t>Secure login and role management</w:t>
+              <w:t>Secure login, role management, Principal approval of new accounts, and emailed temporary passwords</w:t>
             </w:r>
           </w:p>
         </w:tc>
@@ -4969,25 +3652,7 @@
                 <w:sz w:val="20"/>
                 <w:szCs w:val="20"/>
               </w:rPr>
-              <w:t>One subject, assigned section(</w:t>
-            </w:r>
-            <w:proofErr w:type="gramStart"/>
-            <w:r>
-              <w:rPr>
-                <w:color w:val="000000"/>
-                <w:sz w:val="20"/>
-                <w:szCs w:val="20"/>
-              </w:rPr>
-              <w:t>s) —</w:t>
-            </w:r>
-            <w:proofErr w:type="gramEnd"/>
-            <w:r>
-              <w:rPr>
-                <w:color w:val="000000"/>
-                <w:sz w:val="20"/>
-                <w:szCs w:val="20"/>
-              </w:rPr>
-              <w:t xml:space="preserve"> only for sections configured as Departmentalized</w:t>
+              <w:t xml:space="preserve">One subject, assigned section(s) — only for sections configured as Departmentalized</w:t>
             </w:r>
           </w:p>
         </w:tc>
@@ -5107,7 +3772,7 @@
                 <w:sz w:val="20"/>
                 <w:szCs w:val="20"/>
               </w:rPr>
-              <w:t>Approve or return submissions; manage users, roles, subject/section assignments, and each section's staffing mode; configure school and SF10 settings. Validation rules follow DepEd Order No. 8, s. 2015 and are fixed by design; the Administrator can view them read-only.</w:t>
+              <w:t>Approve or return submissions; add user accounts and finish their setup after the Principal approves them; manage roles, subject/section assignments, and each section's staffing mode; configure school and SF10 settings. Validation rules follow DepEd Order No. 8, s. 2015 and are fixed by design; the Administrator can view them read-only.</w:t>
             </w:r>
           </w:p>
         </w:tc>
@@ -5178,7 +3843,7 @@
                 <w:sz w:val="20"/>
                 <w:szCs w:val="20"/>
               </w:rPr>
-              <w:t>View submission progress, analytics, and repository.</w:t>
+              <w:t>View submission progress, analytics, and repository. Approve or reject new accounts and role changes that give more access.</w:t>
             </w:r>
           </w:p>
         </w:tc>
@@ -5200,7 +3865,7 @@
                 <w:sz w:val="20"/>
                 <w:szCs w:val="20"/>
               </w:rPr>
-              <w:t>School-wide, view-only</w:t>
+              <w:t>School-wide; view-only except account approval</w:t>
             </w:r>
           </w:p>
         </w:tc>
@@ -5858,7 +4523,6 @@
             <w:vAlign w:val="center"/>
           </w:tcPr>
           <w:p>
-            <w:proofErr w:type="spellStart"/>
             <w:r>
               <w:rPr>
                 <w:color w:val="000000"/>
@@ -5867,7 +4531,6 @@
               </w:rPr>
               <w:t>ExcelJS</w:t>
             </w:r>
-            <w:proofErr w:type="spellEnd"/>
           </w:p>
         </w:tc>
       </w:tr>
@@ -5985,15 +4648,7 @@
         <w:spacing w:after="160" w:line="276" w:lineRule="auto"/>
       </w:pPr>
       <w:r>
-        <w:t xml:space="preserve">The mobile application extends the </w:t>
-      </w:r>
-      <w:proofErr w:type="spellStart"/>
-      <w:r>
-        <w:t>EduCheck</w:t>
-      </w:r>
-      <w:proofErr w:type="spellEnd"/>
-      <w:r>
-        <w:t xml:space="preserve"> workflow beyond the desktop so that submission status, validation results, and approval actions are never locked behind a laptop. It remains, by design, a supplementary companion to the web platform — all record encoding, e-Class Record uploads, and settings stay on the web system — but within that boundary it gives every user role a reason to open it daily rather than only at their desk.</w:t>
+        <w:t xml:space="preserve">The mobile application extends the EduCheck workflow beyond the desktop so that submission status, validation results, and approval actions are never locked behind a laptop. It remains, by design, a supplementary companion to the web platform — all record encoding, e-Class Record uploads, and settings stay on the web system — but within that boundary it gives every user role a reason to open it daily rather than only at their desk.</w:t>
       </w:r>
     </w:p>
     <w:p>
@@ -7135,23 +5790,13 @@
             <w:vAlign w:val="center"/>
           </w:tcPr>
           <w:p>
-            <w:proofErr w:type="gramStart"/>
-            <w:r>
-              <w:rPr>
-                <w:color w:val="000000"/>
-                <w:sz w:val="20"/>
-                <w:szCs w:val="20"/>
-              </w:rPr>
-              <w:t>Search</w:t>
-            </w:r>
-            <w:proofErr w:type="gramEnd"/>
-            <w:r>
-              <w:rPr>
-                <w:color w:val="000000"/>
-                <w:sz w:val="20"/>
-                <w:szCs w:val="20"/>
-              </w:rPr>
-              <w:t xml:space="preserve"> a student's permanent record by LRN or name for quick reference.</w:t>
+            <w:r>
+              <w:rPr>
+                <w:color w:val="000000"/>
+                <w:sz w:val="20"/>
+                <w:szCs w:val="20"/>
+              </w:rPr>
+              <w:t xml:space="preserve">Search a student's permanent record by LRN or name for quick reference.</w:t>
             </w:r>
           </w:p>
         </w:tc>
@@ -7244,25 +5889,7 @@
                 <w:sz w:val="20"/>
                 <w:szCs w:val="20"/>
               </w:rPr>
-              <w:t xml:space="preserve">A </w:t>
-            </w:r>
-            <w:proofErr w:type="gramStart"/>
-            <w:r>
-              <w:rPr>
-                <w:color w:val="000000"/>
-                <w:sz w:val="20"/>
-                <w:szCs w:val="20"/>
-              </w:rPr>
-              <w:t>log</w:t>
-            </w:r>
-            <w:proofErr w:type="gramEnd"/>
-            <w:r>
-              <w:rPr>
-                <w:color w:val="000000"/>
-                <w:sz w:val="20"/>
-                <w:szCs w:val="20"/>
-              </w:rPr>
-              <w:t xml:space="preserve"> of past alerts, so nothing is lost if a push notification is missed.</w:t>
+              <w:t xml:space="preserve">A log of past alerts, so nothing is lost if a push notification is missed.</w:t>
             </w:r>
           </w:p>
         </w:tc>
@@ -7686,23 +6313,7 @@
                 <w:sz w:val="20"/>
                 <w:szCs w:val="20"/>
               </w:rPr>
-              <w:t xml:space="preserve">Project Leader / </w:t>
-            </w:r>
-            <w:r>
-              <w:rPr>
-                <w:color w:val="000000"/>
-                <w:sz w:val="20"/>
-                <w:szCs w:val="20"/>
-              </w:rPr>
-              <w:t>Backend</w:t>
-            </w:r>
-            <w:r>
-              <w:rPr>
-                <w:color w:val="000000"/>
-                <w:sz w:val="20"/>
-                <w:szCs w:val="20"/>
-              </w:rPr>
-              <w:t xml:space="preserve"> Developer / Documentation Lead</w:t>
+              <w:t xml:space="preserve">Project Leader / Backend Developer / Documentation Lead</w:t>
             </w:r>
           </w:p>
         </w:tc>
@@ -7751,15 +6362,7 @@
                 <w:sz w:val="20"/>
                 <w:szCs w:val="20"/>
               </w:rPr>
-              <w:t>Mobile App</w:t>
-            </w:r>
-            <w:r>
-              <w:rPr>
-                <w:color w:val="000000"/>
-                <w:sz w:val="20"/>
-                <w:szCs w:val="20"/>
-              </w:rPr>
-              <w:t xml:space="preserve"> Developer</w:t>
+              <w:t xml:space="preserve">Mobile App Developer</w:t>
             </w:r>
           </w:p>
         </w:tc>
@@ -7786,18 +6389,8 @@
                 <w:sz w:val="20"/>
                 <w:szCs w:val="20"/>
               </w:rPr>
-              <w:t xml:space="preserve">Aira Jeanelle </w:t>
-            </w:r>
-            <w:proofErr w:type="spellStart"/>
-            <w:r>
-              <w:rPr>
-                <w:color w:val="000000"/>
-                <w:sz w:val="20"/>
-                <w:szCs w:val="20"/>
-              </w:rPr>
-              <w:t>Hepana</w:t>
-            </w:r>
-            <w:proofErr w:type="spellEnd"/>
+              <w:t xml:space="preserve">Aira Jeanelle Hepana</w:t>
+            </w:r>
           </w:p>
         </w:tc>
         <w:tc>
@@ -7834,25 +6427,7 @@
           <w:iCs/>
           <w:color w:val="666666"/>
         </w:rPr>
-        <w:t xml:space="preserve">Development role assignments for Marjorie Gale Arizo and Aira Jeanelle </w:t>
-      </w:r>
-      <w:proofErr w:type="spellStart"/>
-      <w:r>
-        <w:rPr>
-          <w:i/>
-          <w:iCs/>
-          <w:color w:val="666666"/>
-        </w:rPr>
-        <w:t>Hepana</w:t>
-      </w:r>
-      <w:proofErr w:type="spellEnd"/>
-      <w:r>
-        <w:rPr>
-          <w:i/>
-          <w:iCs/>
-          <w:color w:val="666666"/>
-        </w:rPr>
-        <w:t xml:space="preserve"> are provisional — confirm and adjust with the team as needed.</w:t>
+        <w:t xml:space="preserve">Development role assignments for Marjorie Gale Arizo and Aira Jeanelle Hepana are provisional — confirm and adjust with the team as needed.</w:t>
       </w:r>
     </w:p>
     <w:p>
@@ -9757,7 +8332,7 @@
         <w:spacing w:after="80"/>
       </w:pPr>
       <w:r>
-        <w:t>Account and subject/section assignment management (Administrator)</w:t>
+        <w:t>Account and subject/section assignment management (Administrator), with Principal approval of new accounts and role raises, and an emailed temporary password that must be replaced at first sign-in (US-015)</w:t>
       </w:r>
     </w:p>
     <w:p>
@@ -9920,15 +8495,7 @@
         <w:spacing w:after="80"/>
       </w:pPr>
       <w:r>
-        <w:t xml:space="preserve">Automatic generation from a </w:t>
-      </w:r>
-      <w:proofErr w:type="gramStart"/>
-      <w:r>
-        <w:t>completed</w:t>
-      </w:r>
-      <w:proofErr w:type="gramEnd"/>
-      <w:r>
-        <w:t xml:space="preserve"> consolidated record</w:t>
+        <w:t xml:space="preserve">Automatic generation from a completed consolidated record</w:t>
       </w:r>
     </w:p>
     <w:p>
@@ -10022,15 +8589,7 @@
         <w:spacing w:after="80"/>
       </w:pPr>
       <w:r>
-        <w:t xml:space="preserve">Record </w:t>
-      </w:r>
-      <w:proofErr w:type="gramStart"/>
-      <w:r>
-        <w:t>detail</w:t>
-      </w:r>
-      <w:proofErr w:type="gramEnd"/>
-      <w:r>
-        <w:t xml:space="preserve"> view</w:t>
+        <w:t xml:space="preserve">Record detail view</w:t>
       </w:r>
     </w:p>
     <w:p>
@@ -10104,6 +8663,7 @@
     <w:p>
       <w:pPr>
         <w:pStyle w:val="Heading2"/>
+        <w:pageBreakBefore/>
       </w:pPr>
       <w:bookmarkStart w:id="25" w:name="_Toc239847201"/>
       <w:r>
@@ -11116,7 +9676,7 @@
                 <w:sz w:val="20"/>
                 <w:szCs w:val="20"/>
               </w:rPr>
-              <w:t>As a Principal, I want to view school-wide submission progress and analytics so that I can monitor academic performance without requesting manual reports.</w:t>
+              <w:t>As a Principal, I want to view school-wide submission progress and analytics so that I can monitor academic performance without requesting manual reports. Records stay read-only for me; my one action is approving accounts (US-015).</w:t>
             </w:r>
           </w:p>
         </w:tc>
@@ -11231,25 +9791,7 @@
                 <w:sz w:val="20"/>
                 <w:szCs w:val="20"/>
               </w:rPr>
-              <w:t xml:space="preserve">As an Administrator, I want to assign Subject Teachers to specific (subject, section) pairs so that access stays restricted to what each teacher </w:t>
-            </w:r>
-            <w:proofErr w:type="gramStart"/>
-            <w:r>
-              <w:rPr>
-                <w:color w:val="000000"/>
-                <w:sz w:val="20"/>
-                <w:szCs w:val="20"/>
-              </w:rPr>
-              <w:t>actually teaches</w:t>
-            </w:r>
-            <w:proofErr w:type="gramEnd"/>
-            <w:r>
-              <w:rPr>
-                <w:color w:val="000000"/>
-                <w:sz w:val="20"/>
-                <w:szCs w:val="20"/>
-              </w:rPr>
-              <w:t>.</w:t>
+              <w:t xml:space="preserve">As an Administrator, I want to assign Subject Teachers to specific (subject, section) pairs so that access stays restricted to what each teacher actually teaches.</w:t>
             </w:r>
           </w:p>
         </w:tc>
@@ -11479,25 +10021,7 @@
                 <w:sz w:val="20"/>
                 <w:szCs w:val="20"/>
               </w:rPr>
-              <w:t xml:space="preserve">As a School Administrator, I want to set each section as Self-Contained or Departmentalized so that access matches how my school </w:t>
-            </w:r>
-            <w:proofErr w:type="gramStart"/>
-            <w:r>
-              <w:rPr>
-                <w:color w:val="000000"/>
-                <w:sz w:val="20"/>
-                <w:szCs w:val="20"/>
-              </w:rPr>
-              <w:t>actually staffs</w:t>
-            </w:r>
-            <w:proofErr w:type="gramEnd"/>
-            <w:r>
-              <w:rPr>
-                <w:color w:val="000000"/>
-                <w:sz w:val="20"/>
-                <w:szCs w:val="20"/>
-              </w:rPr>
-              <w:t xml:space="preserve"> each grade level, not a fixed assumption.</w:t>
+              <w:t xml:space="preserve">As a School Administrator, I want to set each section as Self-Contained or Departmentalized so that access matches how my school actually staffs each grade level, not a fixed assumption.</w:t>
             </w:r>
           </w:p>
         </w:tc>
@@ -11914,6 +10438,121 @@
           </w:p>
         </w:tc>
       </w:tr>
+      <w:tr>
+        <w:trPr>
+          <w:cantSplit/>
+        </w:trPr>
+        <w:tc>
+          <w:tcPr>
+            <w:tcW w:w="900" w:type="dxa"/>
+            <w:tcMar>
+              <w:top w:w="80" w:type="dxa"/>
+              <w:left w:w="120" w:type="dxa"/>
+              <w:bottom w:w="80" w:type="dxa"/>
+              <w:right w:w="120" w:type="dxa"/>
+            </w:tcMar>
+            <w:vAlign w:val="center"/>
+          </w:tcPr>
+          <w:p>
+            <w:r>
+              <w:rPr>
+                <w:color w:val="000000"/>
+                <w:sz w:val="20"/>
+                <w:szCs w:val="20"/>
+              </w:rPr>
+              <w:t xml:space="preserve">US-015</w:t>
+            </w:r>
+          </w:p>
+        </w:tc>
+        <w:tc>
+          <w:tcPr>
+            <w:tcW w:w="4200" w:type="dxa"/>
+            <w:tcMar>
+              <w:top w:w="80" w:type="dxa"/>
+              <w:left w:w="120" w:type="dxa"/>
+              <w:bottom w:w="80" w:type="dxa"/>
+              <w:right w:w="120" w:type="dxa"/>
+            </w:tcMar>
+            <w:vAlign w:val="center"/>
+          </w:tcPr>
+          <w:p>
+            <w:r>
+              <w:rPr>
+                <w:color w:val="000000"/>
+                <w:sz w:val="20"/>
+                <w:szCs w:val="20"/>
+              </w:rPr>
+              <w:t xml:space="preserve">As a Principal, I want to approve or reject, with a reason, every new account and every role change that gives more access, so that the person who creates accounts is not the only one who grants access to learner records. Once I approve, the School Administrator finishes the setup and the temporary password is emailed to the user's DepEd address.</w:t>
+            </w:r>
+          </w:p>
+        </w:tc>
+        <w:tc>
+          <w:tcPr>
+            <w:tcW w:w="1560" w:type="dxa"/>
+            <w:tcMar>
+              <w:top w:w="80" w:type="dxa"/>
+              <w:left w:w="120" w:type="dxa"/>
+              <w:bottom w:w="80" w:type="dxa"/>
+              <w:right w:w="120" w:type="dxa"/>
+            </w:tcMar>
+            <w:vAlign w:val="center"/>
+          </w:tcPr>
+          <w:p>
+            <w:r>
+              <w:rPr>
+                <w:color w:val="000000"/>
+                <w:sz w:val="20"/>
+                <w:szCs w:val="20"/>
+              </w:rPr>
+              <w:t xml:space="preserve">Authentication</w:t>
+            </w:r>
+          </w:p>
+        </w:tc>
+        <w:tc>
+          <w:tcPr>
+            <w:tcW w:w="900" w:type="dxa"/>
+            <w:tcMar>
+              <w:top w:w="80" w:type="dxa"/>
+              <w:left w:w="120" w:type="dxa"/>
+              <w:bottom w:w="80" w:type="dxa"/>
+              <w:right w:w="120" w:type="dxa"/>
+            </w:tcMar>
+            <w:vAlign w:val="center"/>
+          </w:tcPr>
+          <w:p>
+            <w:r>
+              <w:rPr>
+                <w:color w:val="000000"/>
+                <w:sz w:val="20"/>
+                <w:szCs w:val="20"/>
+              </w:rPr>
+              <w:t xml:space="preserve">Should</w:t>
+            </w:r>
+          </w:p>
+        </w:tc>
+        <w:tc>
+          <w:tcPr>
+            <w:tcW w:w="1800" w:type="dxa"/>
+            <w:tcMar>
+              <w:top w:w="80" w:type="dxa"/>
+              <w:left w:w="120" w:type="dxa"/>
+              <w:bottom w:w="80" w:type="dxa"/>
+              <w:right w:w="120" w:type="dxa"/>
+            </w:tcMar>
+            <w:vAlign w:val="center"/>
+          </w:tcPr>
+          <w:p>
+            <w:r>
+              <w:rPr>
+                <w:color w:val="000000"/>
+                <w:sz w:val="20"/>
+                <w:szCs w:val="20"/>
+              </w:rPr>
+              <w:t xml:space="preserve">Sprint 9</w:t>
+            </w:r>
+          </w:p>
+        </w:tc>
+      </w:tr>
     </w:tbl>
     <w:p>
       <w:pPr>
@@ -11925,25 +10564,7 @@
           <w:iCs/>
           <w:color w:val="666666"/>
         </w:rPr>
-        <w:t>(</w:t>
-      </w:r>
-      <w:proofErr w:type="gramStart"/>
-      <w:r>
-        <w:rPr>
-          <w:i/>
-          <w:iCs/>
-          <w:color w:val="666666"/>
-        </w:rPr>
-        <w:t>Continue</w:t>
-      </w:r>
-      <w:proofErr w:type="gramEnd"/>
-      <w:r>
-        <w:rPr>
-          <w:i/>
-          <w:iCs/>
-          <w:color w:val="666666"/>
-        </w:rPr>
-        <w:t xml:space="preserve"> expanding this backlog throughout development.)</w:t>
+        <w:t xml:space="preserve">(Continue expanding this backlog throughout development.)</w:t>
       </w:r>
     </w:p>
     <w:p>
@@ -12103,15 +10724,7 @@
       </w:pPr>
       <w:bookmarkStart w:id="29" w:name="_Toc239847205"/>
       <w:r>
-        <w:t>9.3 Definition of Ready (</w:t>
-      </w:r>
-      <w:proofErr w:type="spellStart"/>
-      <w:r>
-        <w:t>DoR</w:t>
-      </w:r>
-      <w:proofErr w:type="spellEnd"/>
-      <w:r>
-        <w:t>)</w:t>
+        <w:t>9.3 Definition of Ready (DoR)</w:t>
       </w:r>
       <w:bookmarkEnd w:id="29"/>
     </w:p>
@@ -12185,15 +10798,7 @@
         <w:spacing w:after="80"/>
       </w:pPr>
       <w:r>
-        <w:t xml:space="preserve">The team understands the </w:t>
-      </w:r>
-      <w:proofErr w:type="gramStart"/>
-      <w:r>
-        <w:t>requirement</w:t>
-      </w:r>
-      <w:proofErr w:type="gramEnd"/>
-      <w:r>
-        <w:t>.</w:t>
+        <w:t xml:space="preserve">The team understands the requirement.</w:t>
       </w:r>
     </w:p>
     <w:p>
@@ -12463,13 +11068,8 @@
       <w:pPr>
         <w:spacing w:after="40"/>
       </w:pPr>
-      <w:proofErr w:type="gramStart"/>
-      <w:r>
-        <w:t>Merge</w:t>
-      </w:r>
-      <w:proofErr w:type="gramEnd"/>
-      <w:r>
-        <w:t xml:space="preserve"> to Develop</w:t>
+      <w:r>
+        <w:t xml:space="preserve">Merge to Develop</w:t>
       </w:r>
     </w:p>
     <w:p>
@@ -12889,25 +11489,7 @@
                 <w:sz w:val="20"/>
                 <w:szCs w:val="20"/>
               </w:rPr>
-              <w:t xml:space="preserve">Offline status </w:t>
-            </w:r>
-            <w:proofErr w:type="gramStart"/>
-            <w:r>
-              <w:rPr>
-                <w:color w:val="000000"/>
-                <w:sz w:val="20"/>
-                <w:szCs w:val="20"/>
-              </w:rPr>
-              <w:t>caching</w:t>
-            </w:r>
-            <w:proofErr w:type="gramEnd"/>
-            <w:r>
-              <w:rPr>
-                <w:color w:val="000000"/>
-                <w:sz w:val="20"/>
-                <w:szCs w:val="20"/>
-              </w:rPr>
-              <w:t xml:space="preserve"> on mobile (M-10), refreshed when connectivity returns.</w:t>
+              <w:t xml:space="preserve">Offline status caching on mobile (M-10), refreshed when connectivity returns.</w:t>
             </w:r>
           </w:p>
         </w:tc>
@@ -13280,6 +11862,99 @@
                 <w:szCs w:val="20"/>
               </w:rPr>
               <w:t>Administrator-only assignment control with a confirmation step and audit log.</w:t>
+            </w:r>
+          </w:p>
+        </w:tc>
+      </w:tr>
+      <w:tr>
+        <w:trPr>
+          <w:cantSplit/>
+        </w:trPr>
+        <w:tc>
+          <w:tcPr>
+            <w:tcW w:w="2400" w:type="dxa"/>
+            <w:tcMar>
+              <w:top w:w="80" w:type="dxa"/>
+              <w:left w:w="120" w:type="dxa"/>
+              <w:bottom w:w="80" w:type="dxa"/>
+              <w:right w:w="120" w:type="dxa"/>
+            </w:tcMar>
+            <w:vAlign w:val="center"/>
+          </w:tcPr>
+          <w:p>
+            <w:r>
+              <w:rPr>
+                <w:color w:val="000000"/>
+                <w:sz w:val="20"/>
+                <w:szCs w:val="20"/>
+              </w:rPr>
+              <w:t xml:space="preserve">Account email cannot be sent (no internet)</w:t>
+            </w:r>
+          </w:p>
+        </w:tc>
+        <w:tc>
+          <w:tcPr>
+            <w:tcW w:w="1560" w:type="dxa"/>
+            <w:tcMar>
+              <w:top w:w="80" w:type="dxa"/>
+              <w:left w:w="120" w:type="dxa"/>
+              <w:bottom w:w="80" w:type="dxa"/>
+              <w:right w:w="120" w:type="dxa"/>
+            </w:tcMar>
+            <w:vAlign w:val="center"/>
+          </w:tcPr>
+          <w:p>
+            <w:r>
+              <w:rPr>
+                <w:color w:val="000000"/>
+                <w:sz w:val="20"/>
+                <w:szCs w:val="20"/>
+              </w:rPr>
+              <w:t xml:space="preserve">Medium</w:t>
+            </w:r>
+          </w:p>
+        </w:tc>
+        <w:tc>
+          <w:tcPr>
+            <w:tcW w:w="1200" w:type="dxa"/>
+            <w:tcMar>
+              <w:top w:w="80" w:type="dxa"/>
+              <w:left w:w="120" w:type="dxa"/>
+              <w:bottom w:w="80" w:type="dxa"/>
+              <w:right w:w="120" w:type="dxa"/>
+            </w:tcMar>
+            <w:vAlign w:val="center"/>
+          </w:tcPr>
+          <w:p>
+            <w:r>
+              <w:rPr>
+                <w:color w:val="000000"/>
+                <w:sz w:val="20"/>
+                <w:szCs w:val="20"/>
+              </w:rPr>
+              <w:t xml:space="preserve">Low</w:t>
+            </w:r>
+          </w:p>
+        </w:tc>
+        <w:tc>
+          <w:tcPr>
+            <w:tcW w:w="4200" w:type="dxa"/>
+            <w:tcMar>
+              <w:top w:w="80" w:type="dxa"/>
+              <w:left w:w="120" w:type="dxa"/>
+              <w:bottom w:w="80" w:type="dxa"/>
+              <w:right w:w="120" w:type="dxa"/>
+            </w:tcMar>
+            <w:vAlign w:val="center"/>
+          </w:tcPr>
+          <w:p>
+            <w:r>
+              <w:rPr>
+                <w:color w:val="000000"/>
+                <w:sz w:val="20"/>
+                <w:szCs w:val="20"/>
+              </w:rPr>
+              <w:t xml:space="preserve">The account is still activated; the Administrator hands over the temporary password shown on screen (Known Limitations L-06).</w:t>
             </w:r>
           </w:p>
         </w:tc>

</xml_diff>